<commit_message>
feat: English gold fixture, emails, and tests
Product copy (plaintext + HTML delivery) is English. Fleet and Aygo
example emails, Word headings, and gold spans match. Manifest quotes
stay verbatim in the English source. Gold evaluator 156/156.
</commit_message>
<xml_diff>
--- a/fixtures/fleet-vehicle-return/expected_output/report_reviewed.docx
+++ b/fixtures/fleet-vehicle-return/expected_output/report_reviewed.docx
@@ -8,7 +8,7 @@
         <w:jc w:val="left"/>
       </w:pPr>
       <w:r>
-        <w:t>Protokół zwrotu pojazdu</w:t>
+        <w:t>Vehicle return report</w:t>
       </w:r>
     </w:p>
     <w:p>
@@ -17,7 +17,7 @@
           <w:color w:val="606060"/>
           <w:sz w:val="20"/>
         </w:rPr>
-        <w:t>Dokumentacja fotograficzna stanu pojazdu</w:t>
+        <w:t>Photographic record of vehicle condition</w:t>
       </w:r>
     </w:p>
     <w:tbl>
@@ -38,7 +38,7 @@
           </w:tcPr>
           <w:p>
             <w:r>
-              <w:t>Marka i model</w:t>
+              <w:t>Make and model</w:t>
             </w:r>
           </w:p>
         </w:tc>
@@ -60,7 +60,7 @@
           </w:tcPr>
           <w:p>
             <w:r>
-              <w:t>Numer rejestracyjny</w:t>
+              <w:t>Registration number</w:t>
             </w:r>
           </w:p>
         </w:tc>
@@ -82,7 +82,7 @@
           </w:tcPr>
           <w:p>
             <w:r>
-              <w:t>Przebieg</w:t>
+              <w:t>Mileage</w:t>
             </w:r>
           </w:p>
         </w:tc>
@@ -104,7 +104,7 @@
           </w:tcPr>
           <w:p>
             <w:r>
-              <w:t>Data zwrotu</w:t>
+              <w:t>Return date</w:t>
             </w:r>
           </w:p>
         </w:tc>
@@ -126,7 +126,7 @@
           </w:tcPr>
           <w:p>
             <w:r>
-              <w:t>Osoba zdająca</w:t>
+              <w:t>Returning driver</w:t>
             </w:r>
           </w:p>
         </w:tc>
@@ -149,7 +149,7 @@
       </w:pPr>
       <w:commentRangeStart w:id="0"/>
       <w:r>
-        <w:t>1. Pod maską</w:t>
+        <w:t>1. Under the bonnet</w:t>
       </w:r>
       <w:commentRangeEnd w:id="0"/>
       <w:r>
@@ -202,7 +202,7 @@
           <w:color w:val="606060"/>
           <w:sz w:val="18"/>
         </w:rPr>
-        <w:t>Komora silnika</w:t>
+        <w:t>Engine bay</w:t>
       </w:r>
     </w:p>
     <w:p>
@@ -211,7 +211,7 @@
       </w:pPr>
       <w:commentRangeStart w:id="1"/>
       <w:r>
-        <w:t>2. Fotele</w:t>
+        <w:t>2. Seats</w:t>
       </w:r>
       <w:commentRangeEnd w:id="1"/>
       <w:r>
@@ -264,7 +264,7 @@
           <w:color w:val="606060"/>
           <w:sz w:val="18"/>
         </w:rPr>
-        <w:t>Fotel kierowcy</w:t>
+        <w:t>Driver seat</w:t>
       </w:r>
     </w:p>
     <w:p>
@@ -310,7 +310,7 @@
           <w:color w:val="606060"/>
           <w:sz w:val="18"/>
         </w:rPr>
-        <w:t>Fotel pasażera</w:t>
+        <w:t>Passenger seat</w:t>
       </w:r>
     </w:p>
     <w:p>
@@ -356,7 +356,7 @@
           <w:color w:val="606060"/>
           <w:sz w:val="18"/>
         </w:rPr>
-        <w:t>Kanapa tylna</w:t>
+        <w:t>Rear bench</w:t>
       </w:r>
     </w:p>
     <w:p>
@@ -402,7 +402,7 @@
           <w:color w:val="606060"/>
           <w:sz w:val="18"/>
         </w:rPr>
-        <w:t>Kanapa tylna — ujęcie boczne</w:t>
+        <w:t>Rear bench — side view</w:t>
       </w:r>
     </w:p>
     <w:p>
@@ -411,7 +411,7 @@
       </w:pPr>
       <w:commentRangeStart w:id="2"/>
       <w:r>
-        <w:t>3. Przekątne pojazdu</w:t>
+        <w:t>3. Vehicle diagonals</w:t>
       </w:r>
       <w:commentRangeEnd w:id="2"/>
       <w:r>
@@ -464,7 +464,7 @@
           <w:color w:val="606060"/>
           <w:sz w:val="18"/>
         </w:rPr>
-        <w:t>Przekątna przednia lewa</w:t>
+        <w:t>Front-left diagonal</w:t>
       </w:r>
     </w:p>
     <w:p>
@@ -510,7 +510,7 @@
           <w:color w:val="606060"/>
           <w:sz w:val="18"/>
         </w:rPr>
-        <w:t>Przekątna tylna prawa</w:t>
+        <w:t>Rear-right diagonal</w:t>
       </w:r>
     </w:p>
     <w:p>
@@ -519,7 +519,7 @@
       </w:pPr>
       <w:commentRangeStart w:id="3"/>
       <w:r>
-        <w:t>4. Podsufitka</w:t>
+        <w:t>4. Headliner</w:t>
       </w:r>
       <w:commentRangeEnd w:id="3"/>
       <w:r>
@@ -572,7 +572,7 @@
           <w:color w:val="606060"/>
           <w:sz w:val="18"/>
         </w:rPr>
-        <w:t>Podsufitka</w:t>
+        <w:t>Headliner</w:t>
       </w:r>
     </w:p>
     <w:p>
@@ -618,7 +618,7 @@
           <w:color w:val="606060"/>
           <w:sz w:val="18"/>
         </w:rPr>
-        <w:t>Podsufitka — tył</w:t>
+        <w:t>Headliner — rear</w:t>
       </w:r>
     </w:p>
     <w:p>
@@ -628,7 +628,7 @@
       <w:commentRangeStart w:id="4"/>
       <w:commentRangeStart w:id="5"/>
       <w:r>
-        <w:t>5. Przednia szyba</w:t>
+        <w:t>5. Windscreen</w:t>
       </w:r>
       <w:commentRangeEnd w:id="4"/>
       <w:r>
@@ -688,7 +688,7 @@
           <w:color w:val="606060"/>
           <w:sz w:val="18"/>
         </w:rPr>
-        <w:t>Szyba przednia od środka</w:t>
+        <w:t>Windscreen from inside</w:t>
       </w:r>
     </w:p>
     <w:p>
@@ -734,7 +734,7 @@
           <w:color w:val="606060"/>
           <w:sz w:val="18"/>
         </w:rPr>
-        <w:t>Szyba przednia z zewnątrz</w:t>
+        <w:t>Windscreen from outside</w:t>
       </w:r>
     </w:p>
     <w:p>
@@ -743,7 +743,7 @@
       </w:pPr>
       <w:commentRangeStart w:id="6"/>
       <w:r>
-        <w:t>6. Bieżnik opony</w:t>
+        <w:t>6. Tyre tread</w:t>
       </w:r>
       <w:commentRangeEnd w:id="6"/>
       <w:r>
@@ -796,7 +796,7 @@
           <w:color w:val="606060"/>
           <w:sz w:val="18"/>
         </w:rPr>
-        <w:t>Bieżnik — koło przednie prawe</w:t>
+        <w:t>Tread — front right wheel</w:t>
       </w:r>
     </w:p>
     <w:p>
@@ -806,7 +806,7 @@
       <w:commentRangeStart w:id="7"/>
       <w:commentRangeStart w:id="8"/>
       <w:r>
-        <w:t>7. Bagażnik i wyposażenie</w:t>
+        <w:t>7. Boot and equipment</w:t>
       </w:r>
       <w:commentRangeEnd w:id="7"/>
       <w:r>
@@ -866,7 +866,7 @@
           <w:color w:val="606060"/>
           <w:sz w:val="18"/>
         </w:rPr>
-        <w:t>Bagażnik</w:t>
+        <w:t>Boot</w:t>
       </w:r>
     </w:p>
     <w:p>
@@ -912,7 +912,7 @@
           <w:color w:val="606060"/>
           <w:sz w:val="18"/>
         </w:rPr>
-        <w:t>Bagażnik</w:t>
+        <w:t>Boot</w:t>
       </w:r>
     </w:p>
     <w:p>
@@ -958,7 +958,7 @@
           <w:color w:val="606060"/>
           <w:sz w:val="18"/>
         </w:rPr>
-        <w:t>Wyposażenie pod podłogą bagażnika</w:t>
+        <w:t>Equipment under the boot floor</w:t>
       </w:r>
     </w:p>
     <w:p>
@@ -1004,7 +1004,7 @@
           <w:color w:val="606060"/>
           <w:sz w:val="18"/>
         </w:rPr>
-        <w:t>Koło zapasowe i narzędzia</w:t>
+        <w:t>Spare wheel and tools</w:t>
       </w:r>
     </w:p>
     <w:p>
@@ -1013,7 +1013,7 @@
       </w:pPr>
       <w:commentRangeStart w:id="9"/>
       <w:r>
-        <w:t>8. Zegary</w:t>
+        <w:t>8. Gauges</w:t>
       </w:r>
       <w:commentRangeEnd w:id="9"/>
       <w:r>
@@ -1066,7 +1066,7 @@
           <w:color w:val="606060"/>
           <w:sz w:val="18"/>
         </w:rPr>
-        <w:t>Licznik — 59 650 km</w:t>
+        <w:t>Odometer — 59 650 km</w:t>
       </w:r>
     </w:p>
     <w:p>
@@ -1074,23 +1074,23 @@
         <w:pStyle w:val="Heading1"/>
       </w:pPr>
       <w:r>
-        <w:t>9. Uwagi</w:t>
+        <w:t>9. Notes</w:t>
       </w:r>
     </w:p>
     <w:p>
       <w:r>
-        <w:t>Pojazd zwrócony w stanie ogólnym dobrym. Na desce rozdzielczej widoczny komunikat o awarii skrzyni biegów. Zdjęcia wykonane na stacji paliw.</w:t>
+        <w:t>Vehicle returned in generally good condition. The dashboard shows a gearbox-fault message. Photos taken at a petrol station.</w:t>
       </w:r>
     </w:p>
     <w:p/>
     <w:p>
       <w:r>
-        <w:t>Podpis osoby zdającej: ..................................</w:t>
+        <w:t>Returning driver signature: ..................................</w:t>
       </w:r>
     </w:p>
     <w:p>
       <w:r>
-        <w:t>Podpis osoby przyjmującej: ..................................</w:t>
+        <w:t>Receiving officer signature: ..................................</w:t>
       </w:r>
     </w:p>
     <w:sectPr>
@@ -1130,7 +1130,7 @@
         <w:pStyle w:val="CommentText"/>
       </w:pPr>
       <w:r>
-        <w:t>Uzasadnienie: Two engine-bay photographs were required; one was supplied. The manifest lists "Pod maską" twice and the client's own stated total of 16 photos only reconciles if both mentions are counted.</w:t>
+        <w:t>Justification: Two engine-bay photographs were required; one was supplied. The manifest lists "Under the bonnet" twice and the client's own stated total of 16 photos only reconciles if both mentions are counted.</w:t>
       </w:r>
     </w:p>
     <w:p>
@@ -1143,7 +1143,7 @@
         <w:pStyle w:val="CommentText"/>
       </w:pPr>
       <w:r>
-        <w:t>Sugestia: Supply a second photograph under the bonnet from a different angle, or confirm that the repeated line in the manifest was unintentional.</w:t>
+        <w:t>Suggestion: Supply a second photograph under the bonnet from a different angle, or confirm that the repeated line in the manifest was unintentional.</w:t>
       </w:r>
     </w:p>
   </w:comment>
@@ -1172,7 +1172,7 @@
         <w:pStyle w:val="CommentText"/>
       </w:pPr>
       <w:r>
-        <w:t>Uzasadnienie: Four seat photographs supplied: both front seats and two of the rear bench.</w:t>
+        <w:t>Justification: Four seat photographs supplied: both front seats and two of the rear bench.</w:t>
       </w:r>
     </w:p>
   </w:comment>
@@ -1201,7 +1201,7 @@
         <w:pStyle w:val="CommentText"/>
       </w:pPr>
       <w:r>
-        <w:t>Uzasadnienie: Front three-quarter and rear three-quarter views supplied.</w:t>
+        <w:t>Justification: Front three-quarter and rear three-quarter views supplied.</w:t>
       </w:r>
     </w:p>
   </w:comment>
@@ -1230,7 +1230,7 @@
         <w:pStyle w:val="CommentText"/>
       </w:pPr>
       <w:r>
-        <w:t>Uzasadnienie: Two headliner photographs were supplied, but only one meets the positional constraint. 1000040420.jpg is taken from between the front seats — both front headrests are in frame with the overhead console visible. IMG_20260830_132755 (5).jpg is taken from beside a seat and frames only the rear section of the headliner.</w:t>
+        <w:t>Justification: Two headliner photographs were supplied, but only one meets the positional constraint. 1000040420.jpg is taken from between the front seats — both front headrests are in frame with the overhead console visible. IMG_20260830_132755 (5).jpg is taken from beside a seat and frames only the rear section of the headliner.</w:t>
       </w:r>
     </w:p>
     <w:p>
@@ -1243,7 +1243,7 @@
         <w:pStyle w:val="CommentText"/>
       </w:pPr>
       <w:r>
-        <w:t>Sugestia: Retake the second headliner photograph with the camera positioned between the two front seats, angled up and rearward, as in 1000040420.jpg.</w:t>
+        <w:t>Suggestion: Retake the second headliner photograph with the camera positioned between the two front seats, angled up and rearward, as in 1000040420.jpg.</w:t>
       </w:r>
     </w:p>
   </w:comment>
@@ -1272,7 +1272,7 @@
         <w:pStyle w:val="CommentText"/>
       </w:pPr>
       <w:r>
-        <w:t>Uzasadnienie: Windscreen photographed from the cabin; dashboard and mirror in frame.</w:t>
+        <w:t>Justification: Windscreen photographed from the cabin; dashboard and mirror in frame.</w:t>
       </w:r>
     </w:p>
   </w:comment>
@@ -1301,7 +1301,7 @@
         <w:pStyle w:val="CommentText"/>
       </w:pPr>
       <w:r>
-        <w:t>Uzasadnienie: Windscreen photographed from outside; occupant visible through the glass.</w:t>
+        <w:t>Justification: Windscreen photographed from outside; occupant visible through the glass.</w:t>
       </w:r>
     </w:p>
   </w:comment>
@@ -1330,7 +1330,7 @@
         <w:pStyle w:val="CommentText"/>
       </w:pPr>
       <w:r>
-        <w:t>Uzasadnienie: Tyre tread photographed.</w:t>
+        <w:t>Justification: Tyre tread photographed.</w:t>
       </w:r>
     </w:p>
   </w:comment>
@@ -1359,7 +1359,7 @@
         <w:pStyle w:val="CommentText"/>
       </w:pPr>
       <w:r>
-        <w:t>Uzasadnienie: Boot photographed with the tailgate open.</w:t>
+        <w:t>Justification: Boot photographed with the tailgate open.</w:t>
       </w:r>
     </w:p>
   </w:comment>
@@ -1388,7 +1388,7 @@
         <w:pStyle w:val="CommentText"/>
       </w:pPr>
       <w:r>
-        <w:t>Uzasadnienie: Under-floor equipment photographed: spare wheel, tool kit, fire extinguisher and warning triangle.</w:t>
+        <w:t>Justification: Under-floor equipment photographed: spare wheel, tool kit, fire extinguisher and warning triangle.</w:t>
       </w:r>
     </w:p>
   </w:comment>
@@ -1417,7 +1417,7 @@
         <w:pStyle w:val="CommentText"/>
       </w:pPr>
       <w:r>
-        <w:t>Uzasadnienie: Instrument cluster photographed; odometer legible at 59 650 km.</w:t>
+        <w:t>Justification: Instrument cluster photographed; odometer legible at 59 650 km.</w:t>
       </w:r>
     </w:p>
   </w:comment>

</xml_diff>